<commit_message>
All schools in the Arab sector: rename interviewee 2, remove Beer Sheva
Co-Authored-By: Claude Opus 5.5 <noreply@anthropic.com>
Claude-Session: https://claude.ai/code/session_013eZbSDorZB8dhyvM8NFPNW
</commit_message>
<xml_diff>
--- a/negotiation-final-project/למידה_אישית_כותבת_2.docx
+++ b/negotiation-final-project/למידה_אישית_כותבת_2.docx
@@ -117,7 +117,7 @@
           <w:i w:val="0"/>
           <w:noProof/>
         </w:rPr>
-        <w:t xml:space="preserve"> התוצאה שלי הייתה הסגנון המוותר במקום הראשון והסגנון הנמנע במקום השני. זה לא ממש הפתיע אותי, אבל זו הייתה הפעם הראשונה שראיתי את זה כתוב במספרים, וזה היה לא נעים. מה שלמדתי מהתוצאה הוא שלכל סגנון יש מחיר. סגנון שנראה לי "נחמד" יכול להיות ויתור על אינטרסים שלי, וסגנון שנראה לי "קשוח" מתאים לפעמים בדיוק, למשל מול ספק, כפי שרונית תיארה בריאיון. מודל העניין הכפול עזר לי להבין שהשאלה היא כמה חשובה לי התוצאה וכמה חשוב לי הקשר, ולא מה נעים לי (Rahim, 1983, כפי שמצוטט אצל הוכמן, 2026).</w:t>
+        <w:t xml:space="preserve"> התוצאה שלי הייתה הסגנון המוותר במקום הראשון והסגנון הנמנע במקום השני. זה לא ממש הפתיע אותי, אבל זו הייתה הפעם הראשונה שראיתי את זה כתוב במספרים, וזה היה לא נעים. מה שלמדתי מהתוצאה הוא שלכל סגנון יש מחיר. סגנון שנראה לי "נחמד" יכול להיות ויתור על אינטרסים שלי, וסגנון שנראה לי "קשוח" מתאים לפעמים בדיוק, למשל מול ספק, כפי שרנא תיארה בריאיון. מודל העניין הכפול עזר לי להבין שהשאלה היא כמה חשובה לי התוצאה וכמה חשוב לי הקשר, ולא מה נעים לי (Rahim, 1983, כפי שמצוטט אצל הוכמן, 2026).</w:t>
       </w:r>
     </w:p>
     <w:p>
@@ -128,7 +128,7 @@
           <w:i w:val="0"/>
           <w:noProof/>
         </w:rPr>
-        <w:t>החוויה שהכי השפיעה עליי, רונית והצוות שלה:</w:t>
+        <w:t>החוויה שהכי השפיעה עליי, רנא והצוות שלה:</w:t>
       </w:r>
       <w:r>
         <w:rPr>
@@ -136,7 +136,7 @@
           <w:i w:val="0"/>
           <w:noProof/>
         </w:rPr>
-        <w:t xml:space="preserve"> בריאיון עם רונית הרשימה אותי בעיקר הכנות שלה: היא סיפרה שפתחה את המשא ומתן עם המורות בדרישה קשוחה, מתוך לחץ שקיבלה מלמעלה, ושזו הייתה טעות. מה ששינה את התמונה היה ערב אחד אחרי אזעקה, שבו שמעה את הסיפורים האישיים של המורות. זה היה עבורי המחשה חיה לעיקרון "היו נוקשים בסוגיה, רכים עם האנשים" שלמדנו בשיעור (הוכמן, 2026): רונית לא ויתרה על כך שבית הספר יהיה פתוח, אבל הפסיקה לראות במורות יריבות. זה גרם לי לחשוב על הפעמים שבהן אני עצמי העברתי הלאה לחץ שקיבלתי, בלי לבדוק מה עובר על מי שמולי. בעבודה, כשהמנהלת שלי דרשה לסיים משימה עד סוף השבוע, העברתי את הדרישה לעמיתה כמו שהיא, בלי לשאול אם יש לה מגבלה, וגיליתי מאוחר מדי שהיא בדיוק הייתה בתקופה קשה בבית.</w:t>
+        <w:t xml:space="preserve"> בריאיון עם רנא הרשימה אותי בעיקר הכנות שלה: היא סיפרה שפתחה את המשא ומתן עם המורות בדרישה קשוחה, מתוך לחץ שקיבלה מלמעלה, ושזו הייתה טעות. מה ששינה את התמונה היה ערב אחד אחרי אזעקה, שבו שמעה את הסיפורים האישיים של המורות. זה היה עבורי המחשה חיה לעיקרון "היו נוקשים בסוגיה, רכים עם האנשים" שלמדנו בשיעור (הוכמן, 2026): רנא לא ויתרה על כך שבית הספר יהיה פתוח, אבל הפסיקה לראות במורות יריבות. זה גרם לי לחשוב על הפעמים שבהן אני עצמי העברתי הלאה לחץ שקיבלתי, בלי לבדוק מה עובר על מי שמולי. בעבודה, כשהמנהלת שלי דרשה לסיים משימה עד סוף השבוע, העברתי את הדרישה לעמיתה כמו שהיא, בלי לשאול אם יש לה מגבלה, וגיליתי מאוחר מדי שהיא בדיוק הייתה בתקופה קשה בבית.</w:t>
       </w:r>
     </w:p>
     <w:p>
@@ -155,7 +155,7 @@
           <w:i w:val="0"/>
           <w:noProof/>
         </w:rPr>
-        <w:t xml:space="preserve"> לפני הקורס לא הכרתי את המושג BATNA, והיום הוא הדבר הראשון שאני חושבת עליו. בשיעור הוא הוגדר כחלופה הטובה ביותר להסכם, שנמצאת מחוץ למשא ומתן וקובעת מתי עדיף לקום מהשולחן, ולצידו ה־ZOPA, טווח ההסכמה שבין הקווים האדומים של הצדדים (הוכמן, 2026). במקרה של רונית מול ספק התגבור ראיתי איך שתי הצעות מחיר מחברות אחרות שינו את כל הטון של המשא ומתן. כלשונה, "כשיש לך לאן ללכת, את לא צריכה לאיים, מספיק שהצד השני יודע". הבנתי שהביטחון שלי במשא ומתן לא צריך לבוא מהאופי, אלא מההכנה, כמו שפישר, יורי ופאטון (2013) ממליצים לפתח את ה־BATNA דווקא כשהצד השני חזק יותר.</w:t>
+        <w:t xml:space="preserve"> לפני הקורס לא הכרתי את המושג BATNA, והיום הוא הדבר הראשון שאני חושבת עליו. בשיעור הוא הוגדר כחלופה הטובה ביותר להסכם, שנמצאת מחוץ למשא ומתן וקובעת מתי עדיף לקום מהשולחן, ולצידו ה־ZOPA, טווח ההסכמה שבין הקווים האדומים של הצדדים (הוכמן, 2026). במקרה של רנא מול ספק התגבור ראיתי איך שתי הצעות מחיר מחברות אחרות שינו את כל הטון של המשא ומתן. כלשונה, "כשיש לך לאן ללכת, את לא צריכה לאיים, מספיק שהצד השני יודע". הבנתי שהביטחון שלי במשא ומתן לא צריך לבוא מהאופי, אלא מההכנה, כמו שפישר, יורי ופאטון (2013) ממליצים לפתח את ה־BATNA דווקא כשהצד השני חזק יותר.</w:t>
       </w:r>
     </w:p>
     <w:p>

</xml_diff>